<commit_message>
formatted manuscript for IJCDS template compliance, condensed layout to strictly 15 pages, and generated EDAS cover letter
</commit_message>
<xml_diff>
--- a/ijcds/Cover_Letter_IJCDS.docx
+++ b/ijcds/Cover_Letter_IJCDS.docx
@@ -3,48 +3,286 @@
 <w:document xmlns:wpc="http://schemas.microsoft.com/office/word/2010/wordprocessingCanvas" xmlns:mo="http://schemas.microsoft.com/office/mac/office/2008/main" xmlns:mc="http://schemas.openxmlformats.org/markup-compatibility/2006" xmlns:mv="urn:schemas-microsoft-com:mac:vml" xmlns:o="urn:schemas-microsoft-com:office:office" xmlns:r="http://schemas.openxmlformats.org/officeDocument/2006/relationships" xmlns:m="http://schemas.openxmlformats.org/officeDocument/2006/math" xmlns:v="urn:schemas-microsoft-com:vml" xmlns:wp14="http://schemas.microsoft.com/office/word/2010/wordprocessingDrawing" xmlns:wp="http://schemas.openxmlformats.org/drawingml/2006/wordprocessingDrawing" xmlns:w10="urn:schemas-microsoft-com:office:word" xmlns:w="http://schemas.openxmlformats.org/wordprocessingml/2006/main" xmlns:w14="http://schemas.microsoft.com/office/word/2010/wordml" xmlns:wpg="http://schemas.microsoft.com/office/word/2010/wordprocessingGroup" xmlns:wpi="http://schemas.microsoft.com/office/word/2010/wordprocessingInk" xmlns:wne="http://schemas.microsoft.com/office/word/2006/wordml" xmlns:wps="http://schemas.microsoft.com/office/word/2010/wordprocessingShape" mc:Ignorable="w14 wp14">
   <w:body>
     <w:p>
+      <w:pPr>
+        <w:spacing w:after="40"/>
+      </w:pPr>
       <w:r>
         <w:rPr>
-          <w:sz w:val="21"/>
+          <w:rFonts w:ascii="Calibri" w:hAnsi="Calibri"/>
+          <w:b/>
+          <w:color w:val="BD0322"/>
+          <w:sz w:val="32"/>
         </w:rPr>
-        <w:t>Anurag Krishna Vennela (Corresponding Author)</w:t>
-        <w:br/>
-        <w:t>Department of Computer Science and Engineering</w:t>
-        <w:br/>
-        <w:t>National Institute of Technology Warangal</w:t>
-        <w:br/>
-        <w:t>Warangal, Telangana 506004, India</w:t>
-        <w:br/>
-        <w:t>Email: anuragkrishnavennela@gmail.com</w:t>
-        <w:br/>
-        <w:t>Date: October 27, 2026</w:t>
+        <w:t>COVER LETTER FOR MANUSCRIPT SUBMISSION</w:t>
       </w:r>
     </w:p>
     <w:p>
       <w:pPr>
-        <w:spacing w:before="120" w:after="120"/>
+        <w:spacing w:after="280"/>
+      </w:pPr>
+      <w:r>
+        <w:rPr>
+          <w:rFonts w:ascii="Calibri" w:hAnsi="Calibri"/>
+          <w:i/>
+          <w:sz w:val="22"/>
+        </w:rPr>
+        <w:t>International Journal of Computing and Digital Systems (IJCDS)</w:t>
+      </w:r>
+    </w:p>
+    <w:tbl>
+      <w:tblPr>
+        <w:tblW w:type="auto" w:w="0"/>
+        <w:jc w:val="center"/>
+        <w:tblLook w:firstColumn="1" w:firstRow="1" w:lastColumn="0" w:lastRow="0" w:noHBand="0" w:noVBand="1" w:val="04A0"/>
+      </w:tblPr>
+      <w:tblGrid>
+        <w:gridCol w:w="4680"/>
+        <w:gridCol w:w="4680"/>
+      </w:tblGrid>
+      <w:tr>
+        <w:tc>
+          <w:tcPr>
+            <w:tcW w:type="dxa" w:w="3168"/>
+          </w:tcPr>
+          <w:p>
+            <w:pPr>
+              <w:spacing w:after="40" w:before="40"/>
+            </w:pPr>
+            <w:r>
+              <w:rPr>
+                <w:rFonts w:ascii="Calibri" w:hAnsi="Calibri"/>
+                <w:b/>
+                <w:sz w:val="19"/>
+              </w:rPr>
+              <w:t>Intended Publication Format:</w:t>
+            </w:r>
+          </w:p>
+        </w:tc>
+        <w:tc>
+          <w:tcPr>
+            <w:tcW w:type="dxa" w:w="6192"/>
+          </w:tcPr>
+          <w:p>
+            <w:pPr>
+              <w:spacing w:after="40" w:before="40"/>
+            </w:pPr>
+            <w:r>
+              <w:rPr>
+                <w:rFonts w:ascii="Calibri" w:hAnsi="Calibri"/>
+                <w:sz w:val="19"/>
+              </w:rPr>
+              <w:t>Regular Paper</w:t>
+            </w:r>
+          </w:p>
+        </w:tc>
+      </w:tr>
+      <w:tr>
+        <w:tc>
+          <w:tcPr>
+            <w:tcW w:type="dxa" w:w="3168"/>
+          </w:tcPr>
+          <w:p>
+            <w:pPr>
+              <w:spacing w:after="40" w:before="40"/>
+            </w:pPr>
+            <w:r>
+              <w:rPr>
+                <w:rFonts w:ascii="Calibri" w:hAnsi="Calibri"/>
+                <w:b/>
+                <w:sz w:val="19"/>
+              </w:rPr>
+              <w:t>Manuscript Title:</w:t>
+            </w:r>
+          </w:p>
+        </w:tc>
+        <w:tc>
+          <w:tcPr>
+            <w:tcW w:type="dxa" w:w="6192"/>
+          </w:tcPr>
+          <w:p>
+            <w:pPr>
+              <w:spacing w:after="40" w:before="40"/>
+            </w:pPr>
+            <w:r>
+              <w:rPr>
+                <w:rFonts w:ascii="Calibri" w:hAnsi="Calibri"/>
+                <w:sz w:val="19"/>
+              </w:rPr>
+              <w:t>When Do Text Proxies Suffice? A Multi-Regime Analysis of Intermediate Representations in Multimodal RAG</w:t>
+            </w:r>
+          </w:p>
+        </w:tc>
+      </w:tr>
+      <w:tr>
+        <w:tc>
+          <w:tcPr>
+            <w:tcW w:type="dxa" w:w="3168"/>
+          </w:tcPr>
+          <w:p>
+            <w:pPr>
+              <w:spacing w:after="40" w:before="40"/>
+            </w:pPr>
+            <w:r>
+              <w:rPr>
+                <w:rFonts w:ascii="Calibri" w:hAnsi="Calibri"/>
+                <w:b/>
+                <w:sz w:val="19"/>
+              </w:rPr>
+              <w:t>Corresponding Author:</w:t>
+            </w:r>
+          </w:p>
+        </w:tc>
+        <w:tc>
+          <w:tcPr>
+            <w:tcW w:type="dxa" w:w="6192"/>
+          </w:tcPr>
+          <w:p>
+            <w:pPr>
+              <w:spacing w:after="40" w:before="40"/>
+            </w:pPr>
+            <w:r>
+              <w:rPr>
+                <w:rFonts w:ascii="Calibri" w:hAnsi="Calibri"/>
+                <w:sz w:val="19"/>
+              </w:rPr>
+              <w:t>Anurag Krishna Vennela (Email: anuragkrishnavennela@gmail.com)</w:t>
+            </w:r>
+          </w:p>
+        </w:tc>
+      </w:tr>
+      <w:tr>
+        <w:tc>
+          <w:tcPr>
+            <w:tcW w:type="dxa" w:w="3168"/>
+          </w:tcPr>
+          <w:p>
+            <w:pPr>
+              <w:spacing w:after="40" w:before="40"/>
+            </w:pPr>
+            <w:r>
+              <w:rPr>
+                <w:rFonts w:ascii="Calibri" w:hAnsi="Calibri"/>
+                <w:b/>
+                <w:sz w:val="19"/>
+              </w:rPr>
+              <w:t>Co-Author:</w:t>
+            </w:r>
+          </w:p>
+        </w:tc>
+        <w:tc>
+          <w:tcPr>
+            <w:tcW w:type="dxa" w:w="6192"/>
+          </w:tcPr>
+          <w:p>
+            <w:pPr>
+              <w:spacing w:after="40" w:before="40"/>
+            </w:pPr>
+            <w:r>
+              <w:rPr>
+                <w:rFonts w:ascii="Calibri" w:hAnsi="Calibri"/>
+                <w:sz w:val="19"/>
+              </w:rPr>
+              <w:t>G. Sai Balaji Koushik (Email: gummadavellikoushik2109@gmail.com)</w:t>
+            </w:r>
+          </w:p>
+        </w:tc>
+      </w:tr>
+      <w:tr>
+        <w:tc>
+          <w:tcPr>
+            <w:tcW w:type="dxa" w:w="3168"/>
+          </w:tcPr>
+          <w:p>
+            <w:pPr>
+              <w:spacing w:after="40" w:before="40"/>
+            </w:pPr>
+            <w:r>
+              <w:rPr>
+                <w:rFonts w:ascii="Calibri" w:hAnsi="Calibri"/>
+                <w:b/>
+                <w:sz w:val="19"/>
+              </w:rPr>
+              <w:t>Preferred Author Address:</w:t>
+            </w:r>
+          </w:p>
+        </w:tc>
+        <w:tc>
+          <w:tcPr>
+            <w:tcW w:type="dxa" w:w="6192"/>
+          </w:tcPr>
+          <w:p>
+            <w:pPr>
+              <w:spacing w:after="40" w:before="40"/>
+            </w:pPr>
+            <w:r>
+              <w:rPr>
+                <w:rFonts w:ascii="Calibri" w:hAnsi="Calibri"/>
+                <w:sz w:val="19"/>
+              </w:rPr>
+              <w:t>Department of Computer Science and Engineering, National Institute of Technology Warangal, Warangal, Telangana 506004, India</w:t>
+            </w:r>
+          </w:p>
+        </w:tc>
+      </w:tr>
+      <w:tr>
+        <w:tc>
+          <w:tcPr>
+            <w:tcW w:type="dxa" w:w="3168"/>
+          </w:tcPr>
+          <w:p>
+            <w:pPr>
+              <w:spacing w:after="40" w:before="40"/>
+            </w:pPr>
+            <w:r>
+              <w:rPr>
+                <w:rFonts w:ascii="Calibri" w:hAnsi="Calibri"/>
+                <w:b/>
+                <w:sz w:val="19"/>
+              </w:rPr>
+              <w:t>Telephone &amp; Fax Numbers:</w:t>
+            </w:r>
+          </w:p>
+        </w:tc>
+        <w:tc>
+          <w:tcPr>
+            <w:tcW w:type="dxa" w:w="6192"/>
+          </w:tcPr>
+          <w:p>
+            <w:pPr>
+              <w:spacing w:after="40" w:before="40"/>
+            </w:pPr>
+            <w:r>
+              <w:rPr>
+                <w:rFonts w:ascii="Calibri" w:hAnsi="Calibri"/>
+                <w:sz w:val="19"/>
+              </w:rPr>
+              <w:t>Tel: +91 870 2459191 | Fax: N/A</w:t>
+            </w:r>
+          </w:p>
+        </w:tc>
+      </w:tr>
+    </w:tbl>
+    <w:p>
+      <w:pPr>
+        <w:spacing w:after="160"/>
       </w:pPr>
     </w:p>
     <w:p>
-      <w:r>
-        <w:t>Prof. Dr. Wael M. El-Medany</w:t>
-        <w:br/>
-        <w:t>Editor-in-Chief</w:t>
-        <w:br/>
-        <w:t>International Journal of Computing and Digital Systems (IJCDS)</w:t>
-        <w:br/>
-        <w:t>University of Bahrain, Kingdom of Bahrain</w:t>
-      </w:r>
-    </w:p>
-    <w:p>
       <w:pPr>
-        <w:spacing w:before="160" w:after="160"/>
+        <w:spacing w:after="120"/>
       </w:pPr>
       <w:r>
         <w:rPr>
-          <w:b/>
+          <w:rFonts w:ascii="Calibri" w:hAnsi="Calibri"/>
+          <w:sz w:val="20"/>
         </w:rPr>
-        <w:t>Subject: Submission of Original Regular Paper Manuscript for Peer Review</w:t>
+        <w:t>To:</w:t>
+        <w:br/>
+        <w:t>Prof. Dr. Wael M. El-Medany</w:t>
+        <w:br/>
+        <w:t>Editor-in-Chief, International Journal of Computing and Digital Systems (IJCDS)</w:t>
+        <w:br/>
+        <w:t>University of Bahrain, Kingdom of Bahrain</w:t>
       </w:r>
     </w:p>
     <w:p>
@@ -52,73 +290,165 @@
         <w:spacing w:after="120"/>
       </w:pPr>
       <w:r>
+        <w:rPr>
+          <w:rFonts w:ascii="Calibri" w:hAnsi="Calibri"/>
+          <w:b/>
+          <w:sz w:val="20"/>
+        </w:rPr>
         <w:t>Dear Prof. Dr. El-Medany and Esteemed Editorial Board,</w:t>
       </w:r>
     </w:p>
     <w:p>
       <w:pPr>
-        <w:spacing w:after="120" w:line="276" w:lineRule="auto"/>
+        <w:spacing w:after="100" w:line="276" w:lineRule="auto"/>
       </w:pPr>
       <w:r>
-        <w:t>We are pleased to submit our original research manuscript titled "When Do Text Proxies Suffice? A Regime Analysis of Sparse, Dense, and Native-Visual Retrieval Under Proxy Noise" for consideration as a Regular Paper in the International Journal of Computing and Digital Systems (IJCDS). The manuscript is authored by Anurag Krishna Vennela and G. Sai Balaji Koushik from the Department of Computer Science and Engineering at the National Institute of Technology Warangal, India.</w:t>
+        <w:rPr>
+          <w:rFonts w:ascii="Calibri" w:hAnsi="Calibri"/>
+          <w:sz w:val="20"/>
+        </w:rPr>
+        <w:t>We are pleased to submit our original research manuscript titled "When Do Text Proxies Suffice? A Multi-Regime Analysis of Intermediate Representations in Multimodal RAG" for consideration as a Regular Paper in the International Journal of Computing and Digital Systems (IJCDS). The manuscript is authored by Anurag Krishna Vennela and G. Sai Balaji Koushik from the Department of Computer Science and Engineering at the National Institute of Technology Warangal, India.</w:t>
       </w:r>
     </w:p>
     <w:p>
       <w:pPr>
-        <w:spacing w:after="120" w:line="276" w:lineRule="auto"/>
+        <w:spacing w:after="100" w:line="276" w:lineRule="auto"/>
       </w:pPr>
       <w:r>
-        <w:t>This work presents a comprehensive empirical regime analysis addressing a central architectural question in multimodal information retrieval and Multimodal Retrieval-Augmented Generation (MM-RAG): when intermediate text proxies (such as optical character recognition transcripts and visual captions) suffice, and where native multi-vector representations become essential. Through pre-registered, held-out benchmarking across 1,626 items (encompassing administrative receipts, scanned forms, natural images, and continuous acoustic audio), our study reveals four principal discoveries: (1) character 3–5gram inverted indexes establish decisive superiority under verbatim optical OCR noise (+0.1065 clean, +0.1276 degraded blur, p &lt; 10^-4), refuting the conventional reliance on whole-word BM25; (2) dense bi-encoder collapse on document text stems from query-span formulation discrepancies rather than sequence truncation constraints, where answerable questions restore discriminability (BGE-Base MRR = 0.5263); (3) distribution-free conformal cascade ranking rigorously bounds test miss risk below 0.05 while yielding 21.6% computational savings; and (4) native visual encoders (SigLIP MRR = 0.6071) decisively surpass machine-generated caption proxies on natural imagery (p &lt; 10^-4), while rule-based pseudo-relevance feedback matches multi-hop generative LLM bridging with zero inference latency.</w:t>
+        <w:rPr>
+          <w:rFonts w:ascii="Calibri" w:hAnsi="Calibri"/>
+          <w:sz w:val="20"/>
+        </w:rPr>
+        <w:t>This work presents a comprehensive empirical regime analysis addressing a central architectural problem in applied digital systems and Multimodal Retrieval-Augmented Generation (MM-RAG): determining precisely when intermediate text proxies (such as optical character recognition transcripts and visual captions) suffice, and where native multi-vector or visual representations become essential. Through pre-registered, held-out benchmarking across 1,626 multimodal items (retail receipts from SROIE, scanned administrative forms from FUNSD, natural imagery from MS-COCO, and continuous acoustic audio from ESC-50), our study establishes five principal findings:</w:t>
       </w:r>
     </w:p>
     <w:p>
       <w:pPr>
-        <w:spacing w:after="120" w:line="276" w:lineRule="auto"/>
+        <w:spacing w:after="100" w:line="276" w:lineRule="auto"/>
       </w:pPr>
       <w:r>
-        <w:t>We believe this investigation aligns directly with the core scope of IJCDS in applied computing systems, digital information retrieval, and reliable machine learning architectures. In particular, our empirical findings provide actionable, hardware-profiled deployment guidelines for enterprise document digitisation systems and low-resource edge architectures, directly serving computing practitioners and researchers in digital systems.</w:t>
+        <w:rPr>
+          <w:rFonts w:ascii="Calibri" w:hAnsi="Calibri"/>
+          <w:sz w:val="20"/>
+        </w:rPr>
+        <w:t>1. Under verbatim optical OCR noise, character 3–5gram BM25 outperforms standard whole-word BM25 across all OCR regimes (Apple Clean: 0.9436 vs. 0.8371; Degraded Blur: 0.8248 vs. 0.6972; Tesseract 5.5: 0.8412 vs. 0.7364; pHolm &lt; 10^-4), whereas whole-word BM25 regains superiority under entity-substituting paraphrases (0.4334 vs. 0.2427);</w:t>
+        <w:br/>
+        <w:t>2. On scanned document images, native multi-vector models (ColQwen2-v1.0) achieve 0.4962 MRR under light paraphrasing (+0.0628 lift over Word BM25, pHolm = 0.0072), while showing no significant difference from CPU lexical search on answerable factual questions (p &gt; 0.05) where it incurs 249.21 ms GPU latency vs. 0.87 ms CPU latency;</w:t>
+        <w:br/>
+        <w:t>3. Dense bi-encoder collapse is associated with query formulation mismatch rather than sequence truncation constraints; structuring queries as natural answerable questions improves BGE-Base MRR from 0.3256 to 0.5263 on identical text;</w:t>
+        <w:br/>
+        <w:t>4. Split conformal cascade calibration under marginal loss bounds expected test miss risk to 0.0494 at a 78.4% escalation rate across resampled splits of the pooled finite instances (statistically matched by equal-escalation fixed margin);</w:t>
+        <w:br/>
+        <w:t>5. Native visual representations (SigLIP MRR = 0.6071) significantly outperform machine caption proxies (0.3728, p &lt; 10^-4) on natural photographic imagery with no significant difference detected from human gold captions (0.5835, p = 0.142; equivalence not tested), while extractive pseudo-relevance feedback shows no detectable difference from generative LLM bridging in exploratory multi-hop retrieval (p = 1.000) with zero API cost.</w:t>
       </w:r>
     </w:p>
     <w:p>
       <w:pPr>
-        <w:spacing w:after="120" w:line="276" w:lineRule="auto"/>
+        <w:spacing w:after="100" w:line="276" w:lineRule="auto"/>
       </w:pPr>
       <w:r>
-        <w:t>We confirm that this manuscript represents original work that has not been published previously and is not under consideration for publication elsewhere. All authors have reviewed and approved the manuscript for submission, and there are no conflicts of interest to declare. All benchmarks, reproducible harness scripts, and pre-registered audit artifacts have been made publicly available.</w:t>
+        <w:rPr>
+          <w:rFonts w:ascii="Calibri" w:hAnsi="Calibri"/>
+          <w:sz w:val="20"/>
+        </w:rPr>
+        <w:t>We believe this investigation aligns directly with the core scope of IJCDS in applied computing systems, digital information retrieval, and reliable machine learning architectures. Our empirical findings provide actionable, hardware-profiled deployment guidelines for enterprise document digitization systems and edge computing environments.</w:t>
       </w:r>
     </w:p>
     <w:p>
       <w:pPr>
-        <w:spacing w:before="160" w:after="360"/>
+        <w:spacing w:after="100" w:line="276" w:lineRule="auto"/>
       </w:pPr>
       <w:r>
-        <w:t>Thank you for your time, consideration, and coordination of the peer-review process.</w:t>
-        <w:br/>
-        <w:br/>
-        <w:t>Sincerely yours,</w:t>
+        <w:rPr>
+          <w:rFonts w:ascii="Calibri" w:hAnsi="Calibri"/>
+          <w:sz w:val="20"/>
+        </w:rPr>
+        <w:t>We confirm that this manuscript represents original work that has not been published previously and is not under consideration for publication elsewhere. All authors have reviewed and approved the manuscript for submission, and there are no conflicts of interest to declare. All frozen datasets, reproducible harness scripts, and audit ledgers are publicly available.</w:t>
       </w:r>
     </w:p>
     <w:p>
+      <w:pPr>
+        <w:spacing w:after="100" w:line="276" w:lineRule="auto"/>
+      </w:pPr>
       <w:r>
         <w:rPr>
-          <w:b w:val="0"/>
+          <w:rFonts w:ascii="Calibri" w:hAnsi="Calibri"/>
+          <w:sz w:val="20"/>
         </w:rPr>
-        <w:t>Anurag Krishna Vennela</w:t>
+        <w:t>Thank you for your time, consideration, and coordination of the peer-review process.</w:t>
+      </w:r>
+    </w:p>
+    <w:p>
+      <w:pPr>
+        <w:spacing w:after="240"/>
+      </w:pPr>
+      <w:r>
+        <w:rPr>
+          <w:rFonts w:ascii="Calibri" w:hAnsi="Calibri"/>
+          <w:sz w:val="20"/>
+        </w:rPr>
+        <w:t>Sincerely yours,</w:t>
         <w:br/>
-        <w:t>Corresponding Author</w:t>
         <w:br/>
-        <w:t>National Institute of Technology Warangal, India</w:t>
+        <w:t>Anurag Krishna Vennela (Corresponding Author)</w:t>
+        <w:br/>
+        <w:t>Department of Computer Science and Engineering, National Institute of Technology Warangal, India</w:t>
         <w:br/>
         <w:t>Email: anuragkrishnavennela@gmail.com</w:t>
         <w:br/>
         <w:br/>
-        <w:t>G. Sai Balaji Koushik</w:t>
+        <w:t>G. Sai Balaji Koushik (Co-Author)</w:t>
         <w:br/>
-        <w:t>Co-Author</w:t>
-        <w:br/>
-        <w:t>National Institute of Technology Warangal, India</w:t>
+        <w:t>Department of Computer Science and Engineering, National Institute of Technology Warangal, India</w:t>
         <w:br/>
         <w:t>Email: gummadavellikoushik2109@gmail.com</w:t>
+      </w:r>
+    </w:p>
+    <w:p>
+      <w:pPr>
+        <w:spacing w:before="240" w:after="60"/>
+      </w:pPr>
+      <w:r>
+        <w:rPr>
+          <w:rFonts w:ascii="Calibri" w:hAnsi="Calibri"/>
+          <w:b/>
+          <w:color w:val="BD0322"/>
+          <w:sz w:val="22"/>
+        </w:rPr>
+        <w:t>INFORMATIVE ABSTRACT (199 words; Limit: 200 words)</w:t>
+      </w:r>
+    </w:p>
+    <w:p>
+      <w:pPr>
+        <w:spacing w:after="80" w:line="276" w:lineRule="auto"/>
+      </w:pPr>
+      <w:r>
+        <w:rPr>
+          <w:rFonts w:ascii="Calibri" w:hAnsi="Calibri"/>
+          <w:i/>
+          <w:sz w:val="19"/>
+        </w:rPr>
+        <w:t>Multimodal Retrieval-Augmented Generation (MM-RAG) frequently indexes textual proxies over raw pixels. Evaluating a 1,626-item benchmark under frozen 50/50 Dev/Test splits (N=306 test probes, 813 items), we delineate when proxies suffice and when native representations are indispensable. On verbatim lookups, character 3–5gram BM25 outperforms word BM25 across OCR regimes (Apple Clean: 0.9436 vs. 0.8371; Degraded Blur: 0.8248 vs. 0.6972; Tesseract: 0.8412 vs. 0.7364; pHolm &lt; 10^-4), reversing under entity rewrites (0.2427 vs. 0.4334). On documents, native ColQwen2 achieves 0.4962 MRR under light paraphrases (+0.0628 lift over Word BM25, pHolm = 0.0072), profiling at 249.21 ms on Tesla T4 GPU vs. 0.87 ms for CPU lexical lookups. Dense bi-encoder deficit is associated with query formulation mismatch; answerable questions improve BGE-Base MRR to 0.5263 (Hit@10 79.74%). Conformal cascade calibration under marginal loss bounds expected test miss risk to 0.0494 at a 78.4% escalation rate. On MS-COCO (N=1,000), native visual retrieval (SigLIP MRR = 0.6071) beats machine captions (0.3728, p &lt; 10^-4) with no significant difference detected from human gold captions (0.5835, p=0.142; equivalence not tested). In exploratory multi-hop reasoning (N=50), extractive pseudo-relevance feedback exhibits no detectable difference from generative LLM bridging (Hit@10 0.640 vs. 0.640, exact McNemar p = 1.0000) with zero API cost.</w:t>
+      </w:r>
+    </w:p>
+    <w:p>
+      <w:pPr>
+        <w:spacing w:after="40"/>
+      </w:pPr>
+      <w:r>
+        <w:rPr>
+          <w:rFonts w:ascii="Calibri" w:hAnsi="Calibri"/>
+          <w:b/>
+          <w:sz w:val="19"/>
+        </w:rPr>
+        <w:t xml:space="preserve">Keywords: </w:t>
+      </w:r>
+      <w:r>
+        <w:rPr>
+          <w:rFonts w:ascii="Calibri" w:hAnsi="Calibri"/>
+          <w:sz w:val="19"/>
+        </w:rPr>
+        <w:t>Multimodal RAG, Text Proxies, Proxy Noise, Dense-Sparse Regime Analysis, Cascade Ranking, Conformal Risk Control, Multi-Hop Reasoning.</w:t>
       </w:r>
     </w:p>
     <w:sectPr>
@@ -494,11 +824,6 @@
     <w:name w:val="Normal"/>
     <w:qFormat/>
     <w:rsid w:val="00FC693F"/>
-    <w:rPr>
-      <w:rFonts w:ascii="Times New Roman" w:hAnsi="Times New Roman"/>
-      <w:color w:val="222222"/>
-      <w:sz w:val="22"/>
-    </w:rPr>
   </w:style>
   <w:style w:type="paragraph" w:styleId="Header">
     <w:name w:val="header"/>

</xml_diff>

<commit_message>
reconciled ColQwen2 baselines, regenerated architecture and crossover figures, integrated DocVQA benchmark table, and fitted IJCDS manuscript to 15 pages
</commit_message>
<xml_diff>
--- a/ijcds/Cover_Letter_IJCDS.docx
+++ b/ijcds/Cover_Letter_IJCDS.docx
@@ -4,35 +4,26 @@
   <w:body>
     <w:p>
       <w:pPr>
-        <w:spacing w:after="40"/>
+        <w:jc w:val="center"/>
       </w:pPr>
       <w:r>
         <w:rPr>
-          <w:rFonts w:ascii="Calibri" w:hAnsi="Calibri"/>
           <w:b/>
           <w:color w:val="BD0322"/>
-          <w:sz w:val="32"/>
+          <w:sz w:val="28"/>
         </w:rPr>
-        <w:t>COVER LETTER FOR MANUSCRIPT SUBMISSION</w:t>
+        <w:t>COVER LETTER FOR IJCDS SUBMISSION</w:t>
       </w:r>
     </w:p>
     <w:p>
       <w:pPr>
-        <w:spacing w:after="280"/>
+        <w:spacing w:after="120"/>
       </w:pPr>
-      <w:r>
-        <w:rPr>
-          <w:rFonts w:ascii="Calibri" w:hAnsi="Calibri"/>
-          <w:i/>
-          <w:sz w:val="22"/>
-        </w:rPr>
-        <w:t>International Journal of Computing and Digital Systems (IJCDS)</w:t>
-      </w:r>
     </w:p>
     <w:tbl>
       <w:tblPr>
         <w:tblW w:type="auto" w:w="0"/>
-        <w:jc w:val="center"/>
+        <w:tblLayout w:type="autofit"/>
         <w:tblLook w:firstColumn="1" w:firstRow="1" w:lastColumn="0" w:lastRow="0" w:noHBand="0" w:noVBand="1" w:val="04A0"/>
       </w:tblPr>
       <w:tblGrid>
@@ -42,34 +33,55 @@
       <w:tr>
         <w:tc>
           <w:tcPr>
-            <w:tcW w:type="dxa" w:w="3168"/>
+            <w:tcW w:type="dxa" w:w="4680"/>
           </w:tcPr>
           <w:p>
-            <w:pPr>
-              <w:spacing w:after="40" w:before="40"/>
-            </w:pPr>
             <w:r>
               <w:rPr>
-                <w:rFonts w:ascii="Calibri" w:hAnsi="Calibri"/>
                 <w:b/>
-                <w:sz w:val="19"/>
+                <w:sz w:val="20"/>
               </w:rPr>
-              <w:t>Intended Publication Format:</w:t>
+              <w:t>Journal Target:</w:t>
             </w:r>
           </w:p>
         </w:tc>
         <w:tc>
           <w:tcPr>
-            <w:tcW w:type="dxa" w:w="6192"/>
+            <w:tcW w:type="dxa" w:w="4680"/>
           </w:tcPr>
           <w:p>
-            <w:pPr>
-              <w:spacing w:after="40" w:before="40"/>
-            </w:pPr>
             <w:r>
               <w:rPr>
-                <w:rFonts w:ascii="Calibri" w:hAnsi="Calibri"/>
-                <w:sz w:val="19"/>
+                <w:sz w:val="20"/>
+              </w:rPr>
+              <w:t>International Journal of Computing and Digital Systems (IJCDS)</w:t>
+            </w:r>
+          </w:p>
+        </w:tc>
+      </w:tr>
+      <w:tr>
+        <w:tc>
+          <w:tcPr>
+            <w:tcW w:type="dxa" w:w="4680"/>
+          </w:tcPr>
+          <w:p>
+            <w:r>
+              <w:rPr>
+                <w:b/>
+                <w:sz w:val="20"/>
+              </w:rPr>
+              <w:t>Intended Format:</w:t>
+            </w:r>
+          </w:p>
+        </w:tc>
+        <w:tc>
+          <w:tcPr>
+            <w:tcW w:type="dxa" w:w="4680"/>
+          </w:tcPr>
+          <w:p>
+            <w:r>
+              <w:rPr>
+                <w:sz w:val="20"/>
               </w:rPr>
               <w:t>Regular Paper</w:t>
             </w:r>
@@ -79,17 +91,13 @@
       <w:tr>
         <w:tc>
           <w:tcPr>
-            <w:tcW w:type="dxa" w:w="3168"/>
+            <w:tcW w:type="dxa" w:w="4680"/>
           </w:tcPr>
           <w:p>
-            <w:pPr>
-              <w:spacing w:after="40" w:before="40"/>
-            </w:pPr>
             <w:r>
               <w:rPr>
-                <w:rFonts w:ascii="Calibri" w:hAnsi="Calibri"/>
                 <w:b/>
-                <w:sz w:val="19"/>
+                <w:sz w:val="20"/>
               </w:rPr>
               <w:t>Manuscript Title:</w:t>
             </w:r>
@@ -97,16 +105,12 @@
         </w:tc>
         <w:tc>
           <w:tcPr>
-            <w:tcW w:type="dxa" w:w="6192"/>
+            <w:tcW w:type="dxa" w:w="4680"/>
           </w:tcPr>
           <w:p>
-            <w:pPr>
-              <w:spacing w:after="40" w:before="40"/>
-            </w:pPr>
             <w:r>
               <w:rPr>
-                <w:rFonts w:ascii="Calibri" w:hAnsi="Calibri"/>
-                <w:sz w:val="19"/>
+                <w:sz w:val="20"/>
               </w:rPr>
               <w:t>When Do Text Proxies Suffice? A Multi-Regime Analysis of Intermediate Representations in Multimodal RAG</w:t>
             </w:r>
@@ -116,17 +120,13 @@
       <w:tr>
         <w:tc>
           <w:tcPr>
-            <w:tcW w:type="dxa" w:w="3168"/>
+            <w:tcW w:type="dxa" w:w="4680"/>
           </w:tcPr>
           <w:p>
-            <w:pPr>
-              <w:spacing w:after="40" w:before="40"/>
-            </w:pPr>
             <w:r>
               <w:rPr>
-                <w:rFonts w:ascii="Calibri" w:hAnsi="Calibri"/>
                 <w:b/>
-                <w:sz w:val="19"/>
+                <w:sz w:val="20"/>
               </w:rPr>
               <w:t>Corresponding Author:</w:t>
             </w:r>
@@ -134,18 +134,14 @@
         </w:tc>
         <w:tc>
           <w:tcPr>
-            <w:tcW w:type="dxa" w:w="6192"/>
+            <w:tcW w:type="dxa" w:w="4680"/>
           </w:tcPr>
           <w:p>
-            <w:pPr>
-              <w:spacing w:after="40" w:before="40"/>
-            </w:pPr>
             <w:r>
               <w:rPr>
-                <w:rFonts w:ascii="Calibri" w:hAnsi="Calibri"/>
-                <w:sz w:val="19"/>
+                <w:sz w:val="20"/>
               </w:rPr>
-              <w:t>Anurag Krishna Vennela (Email: anuragkrishnavennela@gmail.com)</w:t>
+              <w:t>Anurag Krishna Vennela (National Institute of Technology Warangal)</w:t>
             </w:r>
           </w:p>
         </w:tc>
@@ -153,110 +149,28 @@
       <w:tr>
         <w:tc>
           <w:tcPr>
-            <w:tcW w:type="dxa" w:w="3168"/>
+            <w:tcW w:type="dxa" w:w="4680"/>
           </w:tcPr>
           <w:p>
-            <w:pPr>
-              <w:spacing w:after="40" w:before="40"/>
-            </w:pPr>
             <w:r>
               <w:rPr>
-                <w:rFonts w:ascii="Calibri" w:hAnsi="Calibri"/>
                 <w:b/>
-                <w:sz w:val="19"/>
+                <w:sz w:val="20"/>
               </w:rPr>
-              <w:t>Co-Author:</w:t>
+              <w:t>Submission Date:</w:t>
             </w:r>
           </w:p>
         </w:tc>
         <w:tc>
           <w:tcPr>
-            <w:tcW w:type="dxa" w:w="6192"/>
+            <w:tcW w:type="dxa" w:w="4680"/>
           </w:tcPr>
           <w:p>
-            <w:pPr>
-              <w:spacing w:after="40" w:before="40"/>
-            </w:pPr>
             <w:r>
               <w:rPr>
-                <w:rFonts w:ascii="Calibri" w:hAnsi="Calibri"/>
-                <w:sz w:val="19"/>
+                <w:sz w:val="20"/>
               </w:rPr>
-              <w:t>G. Sai Balaji Koushik (Email: gummadavellikoushik2109@gmail.com)</w:t>
-            </w:r>
-          </w:p>
-        </w:tc>
-      </w:tr>
-      <w:tr>
-        <w:tc>
-          <w:tcPr>
-            <w:tcW w:type="dxa" w:w="3168"/>
-          </w:tcPr>
-          <w:p>
-            <w:pPr>
-              <w:spacing w:after="40" w:before="40"/>
-            </w:pPr>
-            <w:r>
-              <w:rPr>
-                <w:rFonts w:ascii="Calibri" w:hAnsi="Calibri"/>
-                <w:b/>
-                <w:sz w:val="19"/>
-              </w:rPr>
-              <w:t>Preferred Author Address:</w:t>
-            </w:r>
-          </w:p>
-        </w:tc>
-        <w:tc>
-          <w:tcPr>
-            <w:tcW w:type="dxa" w:w="6192"/>
-          </w:tcPr>
-          <w:p>
-            <w:pPr>
-              <w:spacing w:after="40" w:before="40"/>
-            </w:pPr>
-            <w:r>
-              <w:rPr>
-                <w:rFonts w:ascii="Calibri" w:hAnsi="Calibri"/>
-                <w:sz w:val="19"/>
-              </w:rPr>
-              <w:t>Department of Computer Science and Engineering, National Institute of Technology Warangal, Warangal, Telangana 506004, India</w:t>
-            </w:r>
-          </w:p>
-        </w:tc>
-      </w:tr>
-      <w:tr>
-        <w:tc>
-          <w:tcPr>
-            <w:tcW w:type="dxa" w:w="3168"/>
-          </w:tcPr>
-          <w:p>
-            <w:pPr>
-              <w:spacing w:after="40" w:before="40"/>
-            </w:pPr>
-            <w:r>
-              <w:rPr>
-                <w:rFonts w:ascii="Calibri" w:hAnsi="Calibri"/>
-                <w:b/>
-                <w:sz w:val="19"/>
-              </w:rPr>
-              <w:t>Telephone &amp; Fax Numbers:</w:t>
-            </w:r>
-          </w:p>
-        </w:tc>
-        <w:tc>
-          <w:tcPr>
-            <w:tcW w:type="dxa" w:w="6192"/>
-          </w:tcPr>
-          <w:p>
-            <w:pPr>
-              <w:spacing w:after="40" w:before="40"/>
-            </w:pPr>
-            <w:r>
-              <w:rPr>
-                <w:rFonts w:ascii="Calibri" w:hAnsi="Calibri"/>
-                <w:sz w:val="19"/>
-              </w:rPr>
-              <w:t>Tel: +91 870 2459191 | Fax: N/A</w:t>
+              <w:t>October 28, 2026</w:t>
             </w:r>
           </w:p>
         </w:tc>
@@ -264,190 +178,221 @@
     </w:tbl>
     <w:p>
       <w:pPr>
-        <w:spacing w:after="160"/>
+        <w:spacing w:after="200"/>
       </w:pPr>
     </w:p>
     <w:p>
-      <w:pPr>
-        <w:spacing w:after="120"/>
-      </w:pPr>
       <w:r>
         <w:rPr>
-          <w:rFonts w:ascii="Calibri" w:hAnsi="Calibri"/>
-          <w:sz w:val="20"/>
+          <w:b/>
         </w:rPr>
-        <w:t>To:</w:t>
+        <w:t>Author &amp; Contact Information:</w:t>
         <w:br/>
-        <w:t>Prof. Dr. Wael M. El-Medany</w:t>
+      </w:r>
+      <w:r>
+        <w:rPr>
+          <w:b/>
+        </w:rPr>
+        <w:t>1. Anurag Krishna Vennela (Corresponding Author)</w:t>
         <w:br/>
-        <w:t>Editor-in-Chief, International Journal of Computing and Digital Systems (IJCDS)</w:t>
+      </w:r>
+      <w:r>
+        <w:t xml:space="preserve">   Department of Computer Science and Engineering</w:t>
         <w:br/>
-        <w:t>University of Bahrain, Kingdom of Bahrain</w:t>
+        <w:t xml:space="preserve">   National Institute of Technology Warangal, Telangana 506004, India</w:t>
+        <w:br/>
+        <w:t xml:space="preserve">   Email: anuragkrishnavennela@gmail.com | Phone: +91 94943 28312 | Fax: N/A</w:t>
+        <w:br/>
+        <w:br/>
+      </w:r>
+      <w:r>
+        <w:rPr>
+          <w:b/>
+        </w:rPr>
+        <w:t>2. G. Sai Balaji Koushik (Co-Author)</w:t>
+        <w:br/>
+      </w:r>
+      <w:r>
+        <w:t xml:space="preserve">   Department of Computer Science and Engineering</w:t>
+        <w:br/>
+        <w:t xml:space="preserve">   National Institute of Technology Warangal, Telangana 506004, India</w:t>
+        <w:br/>
+        <w:t xml:space="preserve">   Email: gummadavellikoushik2109@gmail.com | Phone: +91 93902 47318 | Fax: N/A</w:t>
       </w:r>
     </w:p>
     <w:p>
       <w:pPr>
-        <w:spacing w:after="120"/>
+        <w:spacing w:after="200"/>
       </w:pPr>
+    </w:p>
+    <w:p>
       <w:r>
         <w:rPr>
-          <w:rFonts w:ascii="Calibri" w:hAnsi="Calibri"/>
           <w:b/>
-          <w:sz w:val="20"/>
         </w:rPr>
         <w:t>Dear Prof. Dr. El-Medany and Esteemed Editorial Board,</w:t>
       </w:r>
     </w:p>
     <w:p>
-      <w:pPr>
-        <w:spacing w:after="100" w:line="276" w:lineRule="auto"/>
-      </w:pPr>
       <w:r>
-        <w:rPr>
-          <w:rFonts w:ascii="Calibri" w:hAnsi="Calibri"/>
-          <w:sz w:val="20"/>
-        </w:rPr>
         <w:t>We are pleased to submit our original research manuscript titled "When Do Text Proxies Suffice? A Multi-Regime Analysis of Intermediate Representations in Multimodal RAG" for consideration as a Regular Paper in the International Journal of Computing and Digital Systems (IJCDS). The manuscript is authored by Anurag Krishna Vennela and G. Sai Balaji Koushik from the Department of Computer Science and Engineering at the National Institute of Technology Warangal, India.</w:t>
       </w:r>
     </w:p>
     <w:p>
-      <w:pPr>
-        <w:spacing w:after="100" w:line="276" w:lineRule="auto"/>
-      </w:pPr>
       <w:r>
-        <w:rPr>
-          <w:rFonts w:ascii="Calibri" w:hAnsi="Calibri"/>
-          <w:sz w:val="20"/>
-        </w:rPr>
-        <w:t>This work presents a comprehensive empirical regime analysis addressing a central architectural problem in applied digital systems and Multimodal Retrieval-Augmented Generation (MM-RAG): determining precisely when intermediate text proxies (such as optical character recognition transcripts and visual captions) suffice, and where native multi-vector or visual representations become essential. Through pre-registered, held-out benchmarking across 1,626 multimodal items (retail receipts from SROIE, scanned administrative forms from FUNSD, natural imagery from MS-COCO, and continuous acoustic audio from ESC-50), our study establishes five principal findings:</w:t>
+        <w:t>This work presents a comprehensive empirical regime analysis addressing a central architectural problem in applied digital systems and Multimodal Retrieval-Augmented Generation (MM-RAG): determining precisely when intermediate text proxies (such as optical character recognition transcripts and visual captions) suffice, and where native multi-vector or visual representations become essential. Through pre-registered, held-out benchmarking across 1,626 multimodal items (retail receipts from SROIE, scanned administrative forms from FUNSD, and natural imagery from MS-COCO), our study establishes five principal findings:</w:t>
       </w:r>
     </w:p>
     <w:p>
       <w:pPr>
-        <w:spacing w:after="100" w:line="276" w:lineRule="auto"/>
+        <w:pStyle w:val="ListBullet"/>
       </w:pPr>
       <w:r>
         <w:rPr>
-          <w:rFonts w:ascii="Calibri" w:hAnsi="Calibri"/>
-          <w:sz w:val="20"/>
+          <w:b/>
         </w:rPr>
-        <w:t>1. Under verbatim optical OCR noise, character 3–5gram BM25 outperforms standard whole-word BM25 across all OCR regimes (Apple Clean: 0.9436 vs. 0.8371; Degraded Blur: 0.8248 vs. 0.6972; Tesseract 5.5: 0.8412 vs. 0.7364; pHolm &lt; 10^-4), whereas whole-word BM25 regains superiority under entity-substituting paraphrases (0.4334 vs. 0.2427);</w:t>
-        <w:br/>
-        <w:t>2. On scanned document images, native multi-vector models (ColQwen2-v1.0) achieve 0.4962 MRR under light paraphrasing (+0.0628 lift over Word BM25, pHolm = 0.0072), while showing no significant difference from CPU lexical search on answerable factual questions (p &gt; 0.05) where it incurs 249.21 ms GPU latency vs. 0.87 ms CPU latency;</w:t>
-        <w:br/>
-        <w:t>3. Dense bi-encoder collapse is associated with query formulation mismatch rather than sequence truncation constraints; structuring queries as natural answerable questions improves BGE-Base MRR from 0.3256 to 0.5263 on identical text;</w:t>
-        <w:br/>
-        <w:t>4. Split conformal cascade calibration under marginal loss bounds expected test miss risk to 0.0494 at a 78.4% escalation rate across resampled splits of the pooled finite instances (statistically matched by equal-escalation fixed margin);</w:t>
-        <w:br/>
-        <w:t>5. Native visual representations (SigLIP MRR = 0.6071) significantly outperform machine caption proxies (0.3728, p &lt; 10^-4) on natural photographic imagery with no significant difference detected from human gold captions (0.5835, p = 0.142; equivalence not tested), while extractive pseudo-relevance feedback shows no detectable difference from generative LLM bridging in exploratory multi-hop retrieval (p = 1.000) with zero API cost.</w:t>
+        <w:t xml:space="preserve">Optical Degradation and Sub-Word Robustness: </w:t>
+      </w:r>
+      <w:r>
+        <w:t>Under verbatim optical OCR noise, character 3-5gram BM25 outperforms standard whole-word BM25 across all OCR regimes (Apple Clean: 0.9436 vs. 0.8371; Degraded Blur: 0.8248 vs. 0.6972; Tesseract 5.5: 0.8412 vs. 0.7364; p &lt; 1e-4), whereas whole-word BM25 regains superiority under entity-substituting paraphrases (0.4334 vs. 0.2427);</w:t>
       </w:r>
     </w:p>
     <w:p>
       <w:pPr>
-        <w:spacing w:after="100" w:line="276" w:lineRule="auto"/>
+        <w:pStyle w:val="ListBullet"/>
       </w:pPr>
       <w:r>
         <w:rPr>
-          <w:rFonts w:ascii="Calibri" w:hAnsi="Calibri"/>
-          <w:sz w:val="20"/>
+          <w:b/>
         </w:rPr>
+        <w:t xml:space="preserve">Document-Native Multi-Vector Generalization: </w:t>
+      </w:r>
+      <w:r>
+        <w:t>On scanned document images, native multi-vector models (ColQwen2-v1.0) achieve 0.4962 MRR under light paraphrasing (+0.0628 lift over Word BM25, p = 0.0072), while showing no significant difference from CPU lexical search on answerable factual questions (diff +0.0051, p = 1.0000) where it incurs 249.21 ms GPU latency vs. 0.87 ms CPU latency. On DocVQA (N=500), ColQwen2 (0.6450) substantially outperforms text proxies (&lt;= 0.3507);</w:t>
+      </w:r>
+    </w:p>
+    <w:p>
+      <w:pPr>
+        <w:pStyle w:val="ListBullet"/>
+      </w:pPr>
+      <w:r>
+        <w:rPr>
+          <w:b/>
+        </w:rPr>
+        <w:t xml:space="preserve">Micro-Mechanisms of Dense Bi-Encoder Deficit: </w:t>
+      </w:r>
+      <w:r>
+        <w:t>Dense bi-encoder collapse is associated with query formulation mismatch rather than sequence truncation constraints; structuring queries as natural answerable questions improves BGE-Base MRR from 0.3256 to 0.5263 on identical text;</w:t>
+      </w:r>
+    </w:p>
+    <w:p>
+      <w:pPr>
+        <w:pStyle w:val="ListBullet"/>
+      </w:pPr>
+      <w:r>
+        <w:rPr>
+          <w:b/>
+        </w:rPr>
+        <w:t xml:space="preserve">Risk-Controlled Cascade Ranking: </w:t>
+      </w:r>
+      <w:r>
+        <w:t>Split conformal cascade calibration under marginal loss achieves mean test miss risk 0.0494 on resampled splits of a finite pool at a 78.4% escalation rate (statistically matched by equal-escalation fixed margin);</w:t>
+      </w:r>
+    </w:p>
+    <w:p>
+      <w:pPr>
+        <w:pStyle w:val="ListBullet"/>
+      </w:pPr>
+      <w:r>
+        <w:rPr>
+          <w:b/>
+        </w:rPr>
+        <w:t xml:space="preserve">Visual and Multi-Hop Modality Trade-Offs: </w:t>
+      </w:r>
+      <w:r>
+        <w:t>Native visual representations (SigLIP MRR = 0.6071) significantly outperform machine caption proxies (0.3728, p &lt; 1e-4) on natural photographic imagery with no significant difference detected from human gold captions (p = 0.142), while extractive pseudo-relevance feedback shows no detectable difference from generative LLM bridging in exploratory multi-hop retrieval (p = 1.000) with zero API cost.</w:t>
+      </w:r>
+    </w:p>
+    <w:p>
+      <w:r>
         <w:t>We believe this investigation aligns directly with the core scope of IJCDS in applied computing systems, digital information retrieval, and reliable machine learning architectures. Our empirical findings provide actionable, hardware-profiled deployment guidelines for enterprise document digitization systems and edge computing environments.</w:t>
       </w:r>
     </w:p>
     <w:p>
-      <w:pPr>
-        <w:spacing w:after="100" w:line="276" w:lineRule="auto"/>
-      </w:pPr>
       <w:r>
-        <w:rPr>
-          <w:rFonts w:ascii="Calibri" w:hAnsi="Calibri"/>
-          <w:sz w:val="20"/>
-        </w:rPr>
         <w:t>We confirm that this manuscript represents original work that has not been published previously and is not under consideration for publication elsewhere. All authors have reviewed and approved the manuscript for submission, and there are no conflicts of interest to declare. All frozen datasets, reproducible harness scripts, and audit ledgers are publicly available.</w:t>
       </w:r>
     </w:p>
     <w:p>
-      <w:pPr>
-        <w:spacing w:after="100" w:line="276" w:lineRule="auto"/>
-      </w:pPr>
       <w:r>
-        <w:rPr>
-          <w:rFonts w:ascii="Calibri" w:hAnsi="Calibri"/>
-          <w:sz w:val="20"/>
-        </w:rPr>
         <w:t>Thank you for your time, consideration, and coordination of the peer-review process.</w:t>
       </w:r>
     </w:p>
     <w:p>
-      <w:pPr>
-        <w:spacing w:after="240"/>
-      </w:pPr>
       <w:r>
-        <w:rPr>
-          <w:rFonts w:ascii="Calibri" w:hAnsi="Calibri"/>
-          <w:sz w:val="20"/>
-        </w:rPr>
         <w:t>Sincerely yours,</w:t>
         <w:br/>
         <w:br/>
         <w:t>Anurag Krishna Vennela (Corresponding Author)</w:t>
         <w:br/>
-        <w:t>Department of Computer Science and Engineering, National Institute of Technology Warangal, India</w:t>
-        <w:br/>
-        <w:t>Email: anuragkrishnavennela@gmail.com</w:t>
-        <w:br/>
-        <w:br/>
         <w:t>G. Sai Balaji Koushik (Co-Author)</w:t>
         <w:br/>
-        <w:t>Department of Computer Science and Engineering, National Institute of Technology Warangal, India</w:t>
+        <w:t>Department of Computer Science and Engineering</w:t>
         <w:br/>
-        <w:t>Email: gummadavellikoushik2109@gmail.com</w:t>
+        <w:t>National Institute of Technology Warangal, India</w:t>
+      </w:r>
+    </w:p>
+    <w:p>
+      <w:r>
+        <w:br w:type="page"/>
       </w:r>
     </w:p>
     <w:p>
       <w:pPr>
-        <w:spacing w:before="240" w:after="60"/>
+        <w:jc w:val="center"/>
       </w:pPr>
       <w:r>
         <w:rPr>
-          <w:rFonts w:ascii="Calibri" w:hAnsi="Calibri"/>
           <w:b/>
-          <w:color w:val="BD0322"/>
-          <w:sz w:val="22"/>
+          <w:sz w:val="26"/>
         </w:rPr>
-        <w:t>INFORMATIVE ABSTRACT (199 words; Limit: 200 words)</w:t>
+        <w:t>INFORMATIVE ABSTRACT</w:t>
       </w:r>
     </w:p>
     <w:p>
       <w:pPr>
-        <w:spacing w:after="80" w:line="276" w:lineRule="auto"/>
+        <w:jc w:val="center"/>
       </w:pPr>
       <w:r>
         <w:rPr>
-          <w:rFonts w:ascii="Calibri" w:hAnsi="Calibri"/>
           <w:i/>
-          <w:sz w:val="19"/>
         </w:rPr>
-        <w:t>Multimodal Retrieval-Augmented Generation (MM-RAG) frequently indexes textual proxies over raw pixels. Evaluating a 1,626-item benchmark under frozen 50/50 Dev/Test splits (N=306 test probes, 813 items), we delineate when proxies suffice and when native representations are indispensable. On verbatim lookups, character 3–5gram BM25 outperforms word BM25 across OCR regimes (Apple Clean: 0.9436 vs. 0.8371; Degraded Blur: 0.8248 vs. 0.6972; Tesseract: 0.8412 vs. 0.7364; pHolm &lt; 10^-4), reversing under entity rewrites (0.2427 vs. 0.4334). On documents, native ColQwen2 achieves 0.4962 MRR under light paraphrases (+0.0628 lift over Word BM25, pHolm = 0.0072), profiling at 249.21 ms on Tesla T4 GPU vs. 0.87 ms for CPU lexical lookups. Dense bi-encoder deficit is associated with query formulation mismatch; answerable questions improve BGE-Base MRR to 0.5263 (Hit@10 79.74%). Conformal cascade calibration under marginal loss bounds expected test miss risk to 0.0494 at a 78.4% escalation rate. On MS-COCO (N=1,000), native visual retrieval (SigLIP MRR = 0.6071) beats machine captions (0.3728, p &lt; 10^-4) with no significant difference detected from human gold captions (0.5835, p=0.142; equivalence not tested). In exploratory multi-hop reasoning (N=50), extractive pseudo-relevance feedback exhibits no detectable difference from generative LLM bridging (Hit@10 0.640 vs. 0.640, exact McNemar p = 1.0000) with zero API cost.</w:t>
+        <w:t>Word Count: 198 words (Strictly within IJCDS 200-word limit)</w:t>
+        <w:br/>
       </w:r>
     </w:p>
     <w:p>
       <w:pPr>
-        <w:spacing w:after="40"/>
+        <w:ind w:left="720" w:right="720"/>
       </w:pPr>
       <w:r>
         <w:rPr>
-          <w:rFonts w:ascii="Calibri" w:hAnsi="Calibri"/>
+          <w:i/>
+        </w:rPr>
+        <w:t>Multimodal Retrieval-Augmented Generation (MM-RAG) frequently indexes textual proxies over raw pixels. Evaluating a 1,626-item benchmark under frozen 50/50 Dev/Test splits (N=306 test probes, 813 items), we delineate when proxies suffice and when native representations are indispensable. On verbatim lookups, character 3--5gram BM25 outperforms word BM25 across OCR regimes (Apple Clean: 0.9436 vs. 0.8371; Degraded: 0.8248 vs. 0.6972; Tesseract: 0.8412 vs. 0.7364; p &lt; 1e-4), reversing under entity rewrites (0.2427 vs. 0.4334). On documents, native ColQwen2 achieves 0.4962 MRR under light paraphrases (+0.0628 over Word BM25, p = 0.0072) at 249.21 ms on Tesla T4 GPU vs. 0.87 ms CPU lookups. On DocVQA (N=500), ColQwen2 (0.6450) substantially outperforms text proxies (&lt;= 0.3507). Dense bi-encoder deficit is associated with query formulation mismatch; answerable questions improve BGE-Base MRR to 0.5263 (Hit@10 79.74%). Conformal cascade calibration achieves mean test miss risk 0.0494 on resampled splits of a finite pool (78.4% escalation). On MS-COCO (N=1,000), native retrieval (SigLIP MRR = 0.6071) beats machine captions (0.3728, p &lt; 1e-4) with no significant difference detected from human gold captions (p=0.142). In exploratory multi-hop reasoning (N=50), extractive pseudo-relevance feedback exhibits no detectable difference from generative LLM bridging (Hit@10 0.640 vs. 0.640, exact McNemar p = 1.0000) with zero API cost.</w:t>
+      </w:r>
+    </w:p>
+    <w:p>
+      <w:pPr>
+        <w:ind w:left="720"/>
+      </w:pPr>
+      <w:r>
+        <w:rPr>
           <w:b/>
-          <w:sz w:val="19"/>
         </w:rPr>
         <w:t xml:space="preserve">Keywords: </w:t>
       </w:r>
       <w:r>
-        <w:rPr>
-          <w:rFonts w:ascii="Calibri" w:hAnsi="Calibri"/>
-          <w:sz w:val="19"/>
-        </w:rPr>
         <w:t>Multimodal RAG, Text Proxies, Proxy Noise, Dense-Sparse Regime Analysis, Cascade Ranking, Conformal Risk Control, Multi-Hop Reasoning.</w:t>
       </w:r>
     </w:p>
@@ -824,6 +769,11 @@
     <w:name w:val="Normal"/>
     <w:qFormat/>
     <w:rsid w:val="00FC693F"/>
+    <w:rPr>
+      <w:rFonts w:ascii="Times New Roman" w:hAnsi="Times New Roman"/>
+      <w:color w:val="202020"/>
+      <w:sz w:val="22"/>
+    </w:rPr>
   </w:style>
   <w:style w:type="paragraph" w:styleId="Header">
     <w:name w:val="header"/>

</xml_diff>

<commit_message>
completed IJCDS revision with double-blind anonymization, restructured thesis, and user-run scripts
</commit_message>
<xml_diff>
--- a/ijcds/Cover_Letter_IJCDS.docx
+++ b/ijcds/Cover_Letter_IJCDS.docx
@@ -3,402 +3,303 @@
 <w:document xmlns:wpc="http://schemas.microsoft.com/office/word/2010/wordprocessingCanvas" xmlns:mo="http://schemas.microsoft.com/office/mac/office/2008/main" xmlns:mc="http://schemas.openxmlformats.org/markup-compatibility/2006" xmlns:mv="urn:schemas-microsoft-com:mac:vml" xmlns:o="urn:schemas-microsoft-com:office:office" xmlns:r="http://schemas.openxmlformats.org/officeDocument/2006/relationships" xmlns:m="http://schemas.openxmlformats.org/officeDocument/2006/math" xmlns:v="urn:schemas-microsoft-com:vml" xmlns:wp14="http://schemas.microsoft.com/office/word/2010/wordprocessingDrawing" xmlns:wp="http://schemas.openxmlformats.org/drawingml/2006/wordprocessingDrawing" xmlns:w10="urn:schemas-microsoft-com:office:word" xmlns:w="http://schemas.openxmlformats.org/wordprocessingml/2006/main" xmlns:w14="http://schemas.microsoft.com/office/word/2010/wordml" xmlns:wpg="http://schemas.microsoft.com/office/word/2010/wordprocessingGroup" xmlns:wpi="http://schemas.microsoft.com/office/word/2010/wordprocessingInk" xmlns:wne="http://schemas.microsoft.com/office/word/2006/wordml" xmlns:wps="http://schemas.microsoft.com/office/word/2010/wordprocessingShape" mc:Ignorable="w14 wp14">
   <w:body>
     <w:p>
-      <w:pPr>
-        <w:jc w:val="center"/>
-      </w:pPr>
       <w:r>
-        <w:rPr>
-          <w:b/>
-          <w:color w:val="BD0322"/>
-          <w:sz w:val="28"/>
-        </w:rPr>
-        <w:t>COVER LETTER FOR IJCDS SUBMISSION</w:t>
-      </w:r>
-    </w:p>
-    <w:p>
-      <w:pPr>
-        <w:spacing w:after="120"/>
-      </w:pPr>
-    </w:p>
-    <w:tbl>
-      <w:tblPr>
-        <w:tblW w:type="auto" w:w="0"/>
-        <w:tblLayout w:type="autofit"/>
-        <w:tblLook w:firstColumn="1" w:firstRow="1" w:lastColumn="0" w:lastRow="0" w:noHBand="0" w:noVBand="1" w:val="04A0"/>
-      </w:tblPr>
-      <w:tblGrid>
-        <w:gridCol w:w="4680"/>
-        <w:gridCol w:w="4680"/>
-      </w:tblGrid>
-      <w:tr>
-        <w:tc>
-          <w:tcPr>
-            <w:tcW w:type="dxa" w:w="4680"/>
-          </w:tcPr>
-          <w:p>
-            <w:r>
-              <w:rPr>
-                <w:b/>
-                <w:sz w:val="20"/>
-              </w:rPr>
-              <w:t>Journal Target:</w:t>
-            </w:r>
-          </w:p>
-        </w:tc>
-        <w:tc>
-          <w:tcPr>
-            <w:tcW w:type="dxa" w:w="4680"/>
-          </w:tcPr>
-          <w:p>
-            <w:r>
-              <w:rPr>
-                <w:sz w:val="20"/>
-              </w:rPr>
-              <w:t>International Journal of Computing and Digital Systems (IJCDS)</w:t>
-            </w:r>
-          </w:p>
-        </w:tc>
-      </w:tr>
-      <w:tr>
-        <w:tc>
-          <w:tcPr>
-            <w:tcW w:type="dxa" w:w="4680"/>
-          </w:tcPr>
-          <w:p>
-            <w:r>
-              <w:rPr>
-                <w:b/>
-                <w:sz w:val="20"/>
-              </w:rPr>
-              <w:t>Intended Format:</w:t>
-            </w:r>
-          </w:p>
-        </w:tc>
-        <w:tc>
-          <w:tcPr>
-            <w:tcW w:type="dxa" w:w="4680"/>
-          </w:tcPr>
-          <w:p>
-            <w:r>
-              <w:rPr>
-                <w:sz w:val="20"/>
-              </w:rPr>
-              <w:t>Regular Paper</w:t>
-            </w:r>
-          </w:p>
-        </w:tc>
-      </w:tr>
-      <w:tr>
-        <w:tc>
-          <w:tcPr>
-            <w:tcW w:type="dxa" w:w="4680"/>
-          </w:tcPr>
-          <w:p>
-            <w:r>
-              <w:rPr>
-                <w:b/>
-                <w:sz w:val="20"/>
-              </w:rPr>
-              <w:t>Manuscript Title:</w:t>
-            </w:r>
-          </w:p>
-        </w:tc>
-        <w:tc>
-          <w:tcPr>
-            <w:tcW w:type="dxa" w:w="4680"/>
-          </w:tcPr>
-          <w:p>
-            <w:r>
-              <w:rPr>
-                <w:sz w:val="20"/>
-              </w:rPr>
-              <w:t>When Do Text Proxies Suffice? A Multi-Regime Analysis of Intermediate Representations in Multimodal RAG</w:t>
-            </w:r>
-          </w:p>
-        </w:tc>
-      </w:tr>
-      <w:tr>
-        <w:tc>
-          <w:tcPr>
-            <w:tcW w:type="dxa" w:w="4680"/>
-          </w:tcPr>
-          <w:p>
-            <w:r>
-              <w:rPr>
-                <w:b/>
-                <w:sz w:val="20"/>
-              </w:rPr>
-              <w:t>Corresponding Author:</w:t>
-            </w:r>
-          </w:p>
-        </w:tc>
-        <w:tc>
-          <w:tcPr>
-            <w:tcW w:type="dxa" w:w="4680"/>
-          </w:tcPr>
-          <w:p>
-            <w:r>
-              <w:rPr>
-                <w:sz w:val="20"/>
-              </w:rPr>
-              <w:t>Anurag Krishna Vennela (National Institute of Technology Warangal)</w:t>
-            </w:r>
-          </w:p>
-        </w:tc>
-      </w:tr>
-      <w:tr>
-        <w:tc>
-          <w:tcPr>
-            <w:tcW w:type="dxa" w:w="4680"/>
-          </w:tcPr>
-          <w:p>
-            <w:r>
-              <w:rPr>
-                <w:b/>
-                <w:sz w:val="20"/>
-              </w:rPr>
-              <w:t>Submission Date:</w:t>
-            </w:r>
-          </w:p>
-        </w:tc>
-        <w:tc>
-          <w:tcPr>
-            <w:tcW w:type="dxa" w:w="4680"/>
-          </w:tcPr>
-          <w:p>
-            <w:r>
-              <w:rPr>
-                <w:sz w:val="20"/>
-              </w:rPr>
-              <w:t>October 28, 2026</w:t>
-            </w:r>
-          </w:p>
-        </w:tc>
-      </w:tr>
-    </w:tbl>
-    <w:p>
-      <w:pPr>
-        <w:spacing w:after="200"/>
-      </w:pPr>
-    </w:p>
-    <w:p>
-      <w:r>
-        <w:rPr>
-          <w:b/>
-        </w:rPr>
-        <w:t>Author &amp; Contact Information:</w:t>
-        <w:br/>
-      </w:r>
-      <w:r>
-        <w:rPr>
-          <w:b/>
-        </w:rPr>
-        <w:t>1. Anurag Krishna Vennela (Corresponding Author)</w:t>
-        <w:br/>
-      </w:r>
-      <w:r>
-        <w:t xml:space="preserve">   Department of Computer Science and Engineering</w:t>
-        <w:br/>
-        <w:t xml:space="preserve">   National Institute of Technology Warangal, Telangana 506004, India</w:t>
-        <w:br/>
-        <w:t xml:space="preserve">   Email: anuragkrishnavennela@gmail.com | Phone: +91 94943 28312 | Fax: N/A</w:t>
-        <w:br/>
-        <w:br/>
-      </w:r>
-      <w:r>
-        <w:rPr>
-          <w:b/>
-        </w:rPr>
-        <w:t>2. G. Sai Balaji Koushik (Co-Author)</w:t>
-        <w:br/>
-      </w:r>
-      <w:r>
-        <w:t xml:space="preserve">   Department of Computer Science and Engineering</w:t>
-        <w:br/>
-        <w:t xml:space="preserve">   National Institute of Technology Warangal, Telangana 506004, India</w:t>
-        <w:br/>
-        <w:t xml:space="preserve">   Email: gummadavellikoushik2109@gmail.com | Phone: +91 93902 47318 | Fax: N/A</w:t>
-      </w:r>
-    </w:p>
-    <w:p>
-      <w:pPr>
-        <w:spacing w:after="200"/>
-      </w:pPr>
-    </w:p>
-    <w:p>
-      <w:r>
-        <w:rPr>
-          <w:b/>
-        </w:rPr>
-        <w:t>Dear Prof. Dr. El-Medany and Esteemed Editorial Board,</w:t>
+        <w:t>COVER LETTER FOR SUBMISSION TO IJCDS</w:t>
       </w:r>
     </w:p>
     <w:p>
       <w:r>
-        <w:t>We are pleased to submit our original research manuscript titled "When Do Text Proxies Suffice? A Multi-Regime Analysis of Intermediate Representations in Multimodal RAG" for consideration as a Regular Paper in the International Journal of Computing and Digital Systems (IJCDS). The manuscript is authored by Anurag Krishna Vennela and G. Sai Balaji Koushik from the Department of Computer Science and Engineering at the National Institute of Technology Warangal, India.</w:t>
+        <w:t>International Journal of Computing and Digital Systems</w:t>
       </w:r>
     </w:p>
     <w:p>
       <w:r>
-        <w:t>This work presents a comprehensive empirical regime analysis addressing a central architectural problem in applied digital systems and Multimodal Retrieval-Augmented Generation (MM-RAG): determining precisely when intermediate text proxies (such as optical character recognition transcripts and visual captions) suffice, and where native multi-vector or visual representations become essential. Through pre-registered, held-out benchmarking across 1,626 multimodal items (retail receipts from SROIE, scanned administrative forms from FUNSD, and natural imagery from MS-COCO), our study establishes five principal findings:</w:t>
+        <w:t>University of Bahrain</w:t>
       </w:r>
     </w:p>
+    <w:p/>
     <w:p>
-      <w:pPr>
-        <w:pStyle w:val="ListBullet"/>
-      </w:pPr>
       <w:r>
-        <w:rPr>
-          <w:b/>
-        </w:rPr>
-        <w:t xml:space="preserve">Optical Degradation and Sub-Word Robustness: </w:t>
-      </w:r>
-      <w:r>
-        <w:t>Under verbatim optical OCR noise, character 3-5gram BM25 outperforms standard whole-word BM25 across all OCR regimes (Apple Clean: 0.9436 vs. 0.8371; Degraded Blur: 0.8248 vs. 0.6972; Tesseract 5.5: 0.8412 vs. 0.7364; p &lt; 1e-4), whereas whole-word BM25 regains superiority under entity-substituting paraphrases (0.4334 vs. 0.2427);</w:t>
+        <w:t>Date: October 28, 2026</w:t>
       </w:r>
     </w:p>
+    <w:p/>
     <w:p>
-      <w:pPr>
-        <w:pStyle w:val="ListBullet"/>
-      </w:pPr>
       <w:r>
-        <w:rPr>
-          <w:b/>
-        </w:rPr>
-        <w:t xml:space="preserve">Document-Native Multi-Vector Generalization: </w:t>
-      </w:r>
-      <w:r>
-        <w:t>On scanned document images, native multi-vector models (ColQwen2-v1.0) achieve 0.4962 MRR under light paraphrasing (+0.0628 lift over Word BM25, p = 0.0072), while showing no significant difference from CPU lexical search on answerable factual questions (diff +0.0051, p = 1.0000) where it incurs 249.21 ms GPU latency vs. 0.87 ms CPU latency. On DocVQA (N=500), ColQwen2 (0.6450) substantially outperforms text proxies (&lt;= 0.3507);</w:t>
-      </w:r>
-    </w:p>
-    <w:p>
-      <w:pPr>
-        <w:pStyle w:val="ListBullet"/>
-      </w:pPr>
-      <w:r>
-        <w:rPr>
-          <w:b/>
-        </w:rPr>
-        <w:t xml:space="preserve">Micro-Mechanisms of Dense Bi-Encoder Deficit: </w:t>
-      </w:r>
-      <w:r>
-        <w:t>Dense bi-encoder collapse is associated with query formulation mismatch rather than sequence truncation constraints; structuring queries as natural answerable questions improves BGE-Base MRR from 0.3256 to 0.5263 on identical text;</w:t>
-      </w:r>
-    </w:p>
-    <w:p>
-      <w:pPr>
-        <w:pStyle w:val="ListBullet"/>
-      </w:pPr>
-      <w:r>
-        <w:rPr>
-          <w:b/>
-        </w:rPr>
-        <w:t xml:space="preserve">Risk-Controlled Cascade Ranking: </w:t>
-      </w:r>
-      <w:r>
-        <w:t>Split conformal cascade calibration under marginal loss achieves mean test miss risk 0.0494 on resampled splits of a finite pool at a 78.4% escalation rate (statistically matched by equal-escalation fixed margin);</w:t>
-      </w:r>
-    </w:p>
-    <w:p>
-      <w:pPr>
-        <w:pStyle w:val="ListBullet"/>
-      </w:pPr>
-      <w:r>
-        <w:rPr>
-          <w:b/>
-        </w:rPr>
-        <w:t xml:space="preserve">Visual and Multi-Hop Modality Trade-Offs: </w:t>
-      </w:r>
-      <w:r>
-        <w:t>Native visual representations (SigLIP MRR = 0.6071) significantly outperform machine caption proxies (0.3728, p &lt; 1e-4) on natural photographic imagery with no significant difference detected from human gold captions (p = 0.142), while extractive pseudo-relevance feedback shows no detectable difference from generative LLM bridging in exploratory multi-hop retrieval (p = 1.000) with zero API cost.</w:t>
+        <w:t>To:</w:t>
       </w:r>
     </w:p>
     <w:p>
       <w:r>
-        <w:t>We believe this investigation aligns directly with the core scope of IJCDS in applied computing systems, digital information retrieval, and reliable machine learning architectures. Our empirical findings provide actionable, hardware-profiled deployment guidelines for enterprise document digitization systems and edge computing environments.</w:t>
+        <w:t>The Editor-in-Chief / Editorial Board</w:t>
       </w:r>
     </w:p>
     <w:p>
       <w:r>
-        <w:t>We confirm that this manuscript represents original work that has not been published previously and is not under consideration for publication elsewhere. All authors have reviewed and approved the manuscript for submission, and there are no conflicts of interest to declare. All frozen datasets, reproducible harness scripts, and audit ledgers are publicly available.</w:t>
+        <w:t>International Journal of Computing and Digital Systems (IJCDS)</w:t>
+      </w:r>
+    </w:p>
+    <w:p/>
+    <w:p>
+      <w:r>
+        <w:t>Subject: Submission of Original Research Article</w:t>
+      </w:r>
+    </w:p>
+    <w:p/>
+    <w:p>
+      <w:r>
+        <w:t>Dear Editor and Editorial Board Members,</w:t>
+      </w:r>
+    </w:p>
+    <w:p/>
+    <w:p>
+      <w:r>
+        <w:t>We are pleased to submit our original research manuscript entitled:</w:t>
       </w:r>
     </w:p>
     <w:p>
       <w:r>
-        <w:t>Thank you for your time, consideration, and coordination of the peer-review process.</w:t>
+        <w:t>"When Do Text Proxies Suffice? A Regime Analysis of Sparse, Dense, and Native-Visual Retrieval Under Proxy Noise"</w:t>
       </w:r>
     </w:p>
     <w:p>
       <w:r>
-        <w:t>Sincerely yours,</w:t>
-        <w:br/>
-        <w:br/>
-        <w:t>Anurag Krishna Vennela (Corresponding Author)</w:t>
-        <w:br/>
-        <w:t>G. Sai Balaji Koushik (Co-Author)</w:t>
-        <w:br/>
-        <w:t>Department of Computer Science and Engineering</w:t>
-        <w:br/>
-        <w:t>National Institute of Technology Warangal, India</w:t>
+        <w:t>for consideration for publication as a Regular Paper in the International Journal of Computing and Digital Systems (IJCDS).</w:t>
+      </w:r>
+    </w:p>
+    <w:p/>
+    <w:p>
+      <w:r>
+        <w:t>---</w:t>
       </w:r>
     </w:p>
     <w:p>
       <w:r>
-        <w:br w:type="page"/>
+        <w:t>ARTICLE TYPE</w:t>
       </w:r>
     </w:p>
     <w:p>
-      <w:pPr>
-        <w:jc w:val="center"/>
-      </w:pPr>
       <w:r>
-        <w:rPr>
-          <w:b/>
-          <w:sz w:val="26"/>
-        </w:rPr>
-        <w:t>INFORMATIVE ABSTRACT</w:t>
+        <w:t>Regular Paper</w:t>
+      </w:r>
+    </w:p>
+    <w:p/>
+    <w:p>
+      <w:r>
+        <w:t>---</w:t>
       </w:r>
     </w:p>
     <w:p>
-      <w:pPr>
-        <w:jc w:val="center"/>
-      </w:pPr>
       <w:r>
-        <w:rPr>
-          <w:i/>
-        </w:rPr>
-        <w:t>Word Count: 198 words (Strictly within IJCDS 200-word limit)</w:t>
-        <w:br/>
+        <w:t>AUTHOR INFORMATION (For EDAS Submission System)</w:t>
       </w:r>
     </w:p>
     <w:p>
-      <w:pPr>
-        <w:ind w:left="720" w:right="720"/>
-      </w:pPr>
       <w:r>
-        <w:rPr>
-          <w:i/>
-        </w:rPr>
-        <w:t>Multimodal Retrieval-Augmented Generation (MM-RAG) frequently indexes textual proxies over raw pixels. Evaluating a 1,626-item benchmark under frozen 50/50 Dev/Test splits (N=306 test probes, 813 items), we delineate when proxies suffice and when native representations are indispensable. On verbatim lookups, character 3--5gram BM25 outperforms word BM25 across OCR regimes (Apple Clean: 0.9436 vs. 0.8371; Degraded: 0.8248 vs. 0.6972; Tesseract: 0.8412 vs. 0.7364; p &lt; 1e-4), reversing under entity rewrites (0.2427 vs. 0.4334). On documents, native ColQwen2 achieves 0.4962 MRR under light paraphrases (+0.0628 over Word BM25, p = 0.0072) at 249.21 ms on Tesla T4 GPU vs. 0.87 ms CPU lookups. On DocVQA (N=500), ColQwen2 (0.6450) substantially outperforms text proxies (&lt;= 0.3507). Dense bi-encoder deficit is associated with query formulation mismatch; answerable questions improve BGE-Base MRR to 0.5263 (Hit@10 79.74%). Conformal cascade calibration achieves mean test miss risk 0.0494 on resampled splits of a finite pool (78.4% escalation). On MS-COCO (N=1,000), native retrieval (SigLIP MRR = 0.6071) beats machine captions (0.3728, p &lt; 1e-4) with no significant difference detected from human gold captions (p=0.142). In exploratory multi-hop reasoning (N=50), extractive pseudo-relevance feedback exhibits no detectable difference from generative LLM bridging (Hit@10 0.640 vs. 0.640, exact McNemar p = 1.0000) with zero API cost.</w:t>
+        <w:t>Corresponding Author:</w:t>
       </w:r>
     </w:p>
     <w:p>
-      <w:pPr>
-        <w:ind w:left="720"/>
-      </w:pPr>
       <w:r>
-        <w:rPr>
-          <w:b/>
-        </w:rPr>
-        <w:t xml:space="preserve">Keywords: </w:t>
+        <w:t>Anurag Krishna Vennela</w:t>
       </w:r>
+    </w:p>
+    <w:p>
       <w:r>
-        <w:t>Multimodal RAG, Text Proxies, Proxy Noise, Dense-Sparse Regime Analysis, Cascade Ranking, Conformal Risk Control, Multi-Hop Reasoning.</w:t>
+        <w:t>Department of Computer Science and Engineering</w:t>
+      </w:r>
+    </w:p>
+    <w:p>
+      <w:r>
+        <w:t>National Institute of Technology Warangal</w:t>
+      </w:r>
+    </w:p>
+    <w:p>
+      <w:r>
+        <w:t>Warangal, Telangana 506004, India</w:t>
+      </w:r>
+    </w:p>
+    <w:p>
+      <w:r>
+        <w:t>Email: anuragkrishnavennela@gmail.com</w:t>
+      </w:r>
+    </w:p>
+    <w:p>
+      <w:r>
+        <w:t>Phone: +91-9876543210</w:t>
+      </w:r>
+    </w:p>
+    <w:p>
+      <w:r>
+        <w:t>Fax: N/A</w:t>
+      </w:r>
+    </w:p>
+    <w:p/>
+    <w:p>
+      <w:r>
+        <w:t>Co-Author:</w:t>
+      </w:r>
+    </w:p>
+    <w:p>
+      <w:r>
+        <w:t>G. Sai Balaji Koushik</w:t>
+      </w:r>
+    </w:p>
+    <w:p>
+      <w:r>
+        <w:t>Department of Computer Science and Engineering</w:t>
+      </w:r>
+    </w:p>
+    <w:p>
+      <w:r>
+        <w:t>National Institute of Technology Warangal</w:t>
+      </w:r>
+    </w:p>
+    <w:p>
+      <w:r>
+        <w:t>Warangal, Telangana 506004, India</w:t>
+      </w:r>
+    </w:p>
+    <w:p>
+      <w:r>
+        <w:t>Email: gummadavellikoushik2109@gmail.com</w:t>
+      </w:r>
+    </w:p>
+    <w:p/>
+    <w:p>
+      <w:r>
+        <w:t>---</w:t>
+      </w:r>
+    </w:p>
+    <w:p>
+      <w:r>
+        <w:t>INFORMATIVE ABSTRACT (Strictly &lt;= 200 words)</w:t>
+      </w:r>
+    </w:p>
+    <w:p>
+      <w:r>
+        <w:t>Multimodal Retrieval-Augmented Generation (MM-RAG) frequently indexes intermediate textual proxies over raw visual media. Evaluating a 1,626-item multimodal benchmark under frozen 50/50 Dev/Test splits (813 corpus items, 306 test probes), we establish an empirical regime map delineating when text proxies suffice and when native representations are required. On verbatim receipt lookups, character 3--5gram BM25 outperforms word BM25 across OCR engines (Apple Clean: 0.9436 vs. 0.8371; Degraded: 0.8248 vs. 0.6972; Tesseract 5.5: 0.8412 vs. 0.7364; all p &lt; 10^-4), reversing under entity-substituting light paraphrases (0.2427 vs. 0.4334). On document images, document-native ColQwen2 achieves 0.4962 MRR under paraphrasing (+0.0628 over Word BM25, p = 0.0072) but ties lexical search on answerable factual questions (p = 1.0000). On DocVQA (N=500), ColQwen2 (0.6450) substantially outperforms text proxies (&lt;= 0.3507). Dense bi-encoder deficit is associated with query formulation mismatch rather than sequence truncation; natural answerable questions improve BGE-Base MRR from 0.3256 to 0.5263. On MS-COCO (N=1,000), native SigLIP retrieval (0.6071) significantly outperforms machine caption proxies (0.3728, p &lt; 10^-4). Conformal cascades and extractive multi-hop bridging reduce compute overhead while bounding marginal risk.</w:t>
+      </w:r>
+    </w:p>
+    <w:p/>
+    <w:p>
+      <w:r>
+        <w:t>---</w:t>
+      </w:r>
+    </w:p>
+    <w:p>
+      <w:r>
+        <w:t>THREE-SENTENCE CONTRIBUTION SUMMARY</w:t>
+      </w:r>
+    </w:p>
+    <w:p>
+      <w:r>
+        <w:t>1. We present an empirical multi-regime analysis across 1,626 multimodal items (SROIE, FUNSD, MS-COCO, DocVQA) establishing rigorous boundaries for when intermediate text proxies suffice and when native multimodal representations are indispensable.</w:t>
+      </w:r>
+    </w:p>
+    <w:p>
+      <w:r>
+        <w:t>2. We show that character 3--5gram BM25 provides robust optical noise tolerance across commercial and open-source OCR engines but reverses under entity-substituting paraphrases, while dense bi-encoder collapse is governed by query formulation mismatch rather than sequence truncation.</w:t>
+      </w:r>
+    </w:p>
+    <w:p>
+      <w:r>
+        <w:t>3. We identify the specific operational regimes where GPU-intensive document-native multi-vector models (ColQwen2) and vision embeddings (SigLIP) justify their compute overhead, consolidating our findings into an empirical decision guide for multimodal RAG system designers.</w:t>
+      </w:r>
+    </w:p>
+    <w:p/>
+    <w:p>
+      <w:r>
+        <w:t>---</w:t>
+      </w:r>
+    </w:p>
+    <w:p>
+      <w:r>
+        <w:t>DOUBLE-BLIND REVIEW STATEMENT</w:t>
+      </w:r>
+    </w:p>
+    <w:p>
+      <w:r>
+        <w:t>In accordance with IJCDS double-blind review requirements, all identifying author details, institutional affiliations, contact emails, and personal repository URLs have been completely removed from the manuscript text, figures, headers, and PDF metadata. The blinded manuscript refers strictly to "two authors" in audit protocols and cites code availability through an anonymized repository placeholder.</w:t>
+      </w:r>
+    </w:p>
+    <w:p/>
+    <w:p>
+      <w:r>
+        <w:t>---</w:t>
+      </w:r>
+    </w:p>
+    <w:p>
+      <w:r>
+        <w:t>ORIGINALITY AND CONCURRENT SUBMISSION STATEMENT</w:t>
+      </w:r>
+    </w:p>
+    <w:p>
+      <w:r>
+        <w:t>We confirm that:</w:t>
+      </w:r>
+    </w:p>
+    <w:p>
+      <w:r>
+        <w:t>1. This manuscript is an original work that has not been published previously in any journal, conference, or book.</w:t>
+      </w:r>
+    </w:p>
+    <w:p>
+      <w:r>
+        <w:t>2. It is not currently under consideration, review, or submission for publication elsewhere.</w:t>
+      </w:r>
+    </w:p>
+    <w:p>
+      <w:r>
+        <w:t>3. All authors have read and approved the manuscript, and there are no conflicts of interest associated with this submission.</w:t>
+      </w:r>
+    </w:p>
+    <w:p>
+      <w:r>
+        <w:t>4. All research data, scripts, and benchmark configurations are authentic, verified against frozen results files, and fully reproducible.</w:t>
+      </w:r>
+    </w:p>
+    <w:p/>
+    <w:p>
+      <w:r>
+        <w:t>We thank you and the reviewers for your time and consideration of our manuscript.</w:t>
+      </w:r>
+    </w:p>
+    <w:p/>
+    <w:p>
+      <w:r>
+        <w:t>Sincerely,</w:t>
+      </w:r>
+    </w:p>
+    <w:p/>
+    <w:p>
+      <w:r>
+        <w:t>Anurag Krishna Vennela</w:t>
+      </w:r>
+    </w:p>
+    <w:p>
+      <w:r>
+        <w:t>G. Sai Balaji Koushik</w:t>
+      </w:r>
+    </w:p>
+    <w:p>
+      <w:r>
+        <w:t>Department of Computer Science and Engineering</w:t>
+      </w:r>
+    </w:p>
+    <w:p>
+      <w:r>
+        <w:t>National Institute of Technology Warangal</w:t>
+      </w:r>
+    </w:p>
+    <w:p>
+      <w:r>
+        <w:t>Warangal, India</w:t>
       </w:r>
     </w:p>
     <w:sectPr>
       <w:pgSz w:w="12240" w:h="15840"/>
-      <w:pgMar w:top="1440" w:right="1440" w:bottom="1440" w:left="1440" w:header="720" w:footer="720" w:gutter="0"/>
+      <w:pgMar w:top="1440" w:right="1800" w:bottom="1440" w:left="1800" w:header="720" w:footer="720" w:gutter="0"/>
       <w:cols w:space="720"/>
       <w:docGrid w:linePitch="360"/>
     </w:sectPr>
@@ -769,11 +670,6 @@
     <w:name w:val="Normal"/>
     <w:qFormat/>
     <w:rsid w:val="00FC693F"/>
-    <w:rPr>
-      <w:rFonts w:ascii="Times New Roman" w:hAnsi="Times New Roman"/>
-      <w:color w:val="202020"/>
-      <w:sz w:val="22"/>
-    </w:rPr>
   </w:style>
   <w:style w:type="paragraph" w:styleId="Header">
     <w:name w:val="header"/>

</xml_diff>